<commit_message>
Master resume: quantify ARR-risk bullet — composite model framing
Fix #3 (quantification), part 4 of 4 (final). "Led ARR-focused risk
tracking" -> "Built an ARR-risk model... scoring the top 10 accounts
on a blend of ARR exposure, reported-case volume, true-defect count,
and Salesforce sentiment — not raw ticket counts." Reframes from a
report to a designed composite instrument; "not raw ticket counts"
is the opinionated-instrumentation signal that parallels "opinionated
routing, not a dashboard" and "built for signal, not ceremony" and
ties to the five-panel "true defects vs noise" through-line.

All four quantification passes now complete. Master regenerated to
docx + pdf. Per-role propagation is the remaining step.

https://claude.ai/code/session_017dM7V2VFD2VHNDNWBmpDHh
</commit_message>
<xml_diff>
--- a/applications/Ian_Cowpar_Resume_Master.docx
+++ b/applications/Ian_Cowpar_Resume_Master.docx
@@ -129,7 +129,7 @@
           <w:b/>
           <w:i w:val="0"/>
         </w:rPr>
-        <w:t xml:space="preserve">Built a 0→1 self-serve migration tool, idea to production. </w:t>
+        <w:t xml:space="preserve">Built a 0→1 self-serve migration tool — idea to engineering-ready in one week. </w:t>
       </w:r>
       <w:r>
         <w:rPr>
@@ -137,7 +137,7 @@
           <w:b w:val="0"/>
           <w:i w:val="0"/>
         </w:rPr>
-        <w:t>Took it from concept through three business-epic decomposition (UI, rules, deployment), wrote the working prototype myself in Claude Code, designed the UX feedback loop and persona, and handed engineering the full delivery package — bepics, epics, stories, Gantt, roadmap. Now in active production; the Services org runs migrations independently without an engineering ticket.</w:t>
+        <w:t>Took it from concept through three business-epic decomposition (UI, rules, deployment), wrote the working prototype myself in Claude Code, designed the UX feedback loop and persona, and handed engineering a complete delivery package — bepics, epics, stories, Gantt, roadmap. In production with the first customer cohort — 6 enterprise accounts in flight, Services running migrations without an engineering ticket, Services-Consultant feedback loop active.</w:t>
       </w:r>
     </w:p>
     <w:p>
@@ -160,7 +160,7 @@
           <w:b w:val="0"/>
           <w:i w:val="0"/>
         </w:rPr>
-        <w:t>Started as a personal automation library, scaled into team-wide shared capability without a top-down mandate. Adoption spread because the thing worked better than what it replaced — the only kind of adoption that lasts.</w:t>
+        <w:t>Started as a personal automation library; built it into a shared repo 20 PMs could pull from, ran the first peer group, and sat with two PMs directly to configure it for their own use cases. Designed from the start to spread without a mandate — shared infrastructure, not personal tooling, because the only adoption that lasts is the kind nobody had to order.</w:t>
       </w:r>
     </w:p>
     <w:p>
@@ -183,7 +183,7 @@
           <w:b w:val="0"/>
           <w:i w:val="0"/>
         </w:rPr>
-        <w:t>classifying open issues across customer escalations, code defects, internal bugs, CVEs, and noise across four products; auto-refreshed daily, with a Claude Code function I built into the tool surfacing the single highest-leverage action per panel. Opinionated routing, not a dashboard.</w:t>
+        <w:t>classifying open issues across customer escalations, code defects, internal bugs, CVEs, and noise across four products; auto-refreshed daily, with a Claude Code function I built into the tool surfacing the single highest-leverage action per panel. Cut the working defect list ~97% — roughly 200 apparent issues resolved to a real five — so engineering triaged signal, not noise. Opinionated routing, not a dashboard.</w:t>
       </w:r>
     </w:p>
     <w:p>
@@ -221,7 +221,7 @@
           <w:b/>
           <w:i w:val="0"/>
         </w:rPr>
-        <w:t xml:space="preserve">Led ARR-focused risk tracking for the UTA upgrade program: </w:t>
+        <w:t xml:space="preserve">Built an ARR-risk model for the UTA upgrade program </w:t>
       </w:r>
       <w:r>
         <w:rPr>
@@ -229,7 +229,7 @@
           <w:b w:val="0"/>
           <w:i w:val="0"/>
         </w:rPr>
-        <w:t>automated weekly reporting routes every open blocker to the program lead; live tracking surfaces aging issues before escalation.</w:t>
+        <w:t>scoring the top 10 accounts on a blend of ARR exposure, reported-case volume, true-defect count, and Salesforce sentiment — not raw ticket counts. Automated weekly reporting routed every open blocker to the program lead; live tracking surfaced aging issues before they escalated.</w:t>
       </w:r>
     </w:p>
     <w:p>

</xml_diff>